<commit_message>
Make Bob skill coherent with the trade-forecasting lab
The repo's Bob prompts and student doc pointed at the old fraud/Terraform
Bob skill (bleporini/fraud-confluent-terraform-bob,
.bob/skills/confluent-iac-terraform), which has nothing to do with this
Flink-SQL-only trade-forecasting lab.

- Add .bob/skills/trade-forecasting-flink/SKILL.md: a lab-specific skill
  teaching only this lab's patterns (Datagen AVRO connectors,
  catalog=env/database=cluster, CREATE MATERIALIZED TABLE, temporal join,
  TUMBLE TVF, ML_FORECAST, SUSPEND/RESUME). No Terraform, no Python producer.
- Add .bobignore so opening the repo as a Bob workspace surfaces only this
  skill, not the deprecated one under old/.
- Repoint BOB_PROMPTS.md and lab/build_lab.js (regenerated the .docx) at this
  repo's own skill; reframe the Terraform stretch as an in-lab alert table.
- Note the skill in the README repository map.

Co-Authored-By: Claude Opus 4.8 <noreply@anthropic.com>
</commit_message>
<xml_diff>
--- a/lab/Trade-Forecasting-Confluent-Bob-Lab.docx
+++ b/lab/Trade-Forecasting-Confluent-Bob-Lab.docx
@@ -2283,7 +2283,7 @@
         <w:t xml:space="preserve">skill</w:t>
       </w:r>
       <w:r>
-        <w:t xml:space="preserve"> — a file that teaches it Confluent + Flink patterns. A ready-made one lives in the companion workspace:</w:t>
+        <w:t xml:space="preserve"> — a file that teaches it this lab's Confluent + Flink patterns. One ships inside this lab's repo:</w:t>
       </w:r>
     </w:p>
     <w:p>
@@ -2298,7 +2298,7 @@
           <w:sz w:val="18"/>
           <w:szCs w:val="18"/>
         </w:rPr>
-        <w:t xml:space="preserve">git clone https://github.com/bleporini/fraud-confluent-terraform-bob.git</w:t>
+        <w:t xml:space="preserve">git clone https://github.com/EdySamaha/IBM-confluent-bob-lab.git</w:t>
       </w:r>
     </w:p>
     <w:p>
@@ -2311,13 +2311,13 @@
         <w:spacing w:after="60"/>
       </w:pPr>
       <w:r>
-        <w:t xml:space="preserve">Open that folder as your Bob workspace so Bob discovers the skill at </w:t>
-      </w:r>
-      <w:r>
-        <w:rPr>
-          <w:rFonts w:ascii="Consolas" w:cs="Consolas" w:eastAsia="Consolas" w:hAnsi="Consolas"/>
-        </w:rPr>
-        <w:t xml:space="preserve">.bob/skills/confluent-iac-terraform/SKILL.md</w:t>
+        <w:t xml:space="preserve">Open the cloned repo folder as your Bob workspace so Bob discovers the skill at </w:t>
+      </w:r>
+      <w:r>
+        <w:rPr>
+          <w:rFonts w:ascii="Consolas" w:cs="Consolas" w:eastAsia="Consolas" w:hAnsi="Consolas"/>
+        </w:rPr>
+        <w:t xml:space="preserve">.bob/skills/trade-forecasting-flink/SKILL.md</w:t>
       </w:r>
       <w:r>
         <w:t xml:space="preserve">, or</w:t>

</xml_diff>